<commit_message>
Update CV dan file portofolio baru
</commit_message>
<xml_diff>
--- a/CV ATS Muhamad Irsyad Nurdin.docx
+++ b/CV ATS Muhamad Irsyad Nurdin.docx
@@ -446,7 +446,27 @@
           <w:sz w:val="24"/>
           <w:szCs w:val="24"/>
         </w:rPr>
-        <w:t>Peserta Studi Independen - Bangkit Academy 2024 (Mobile Development Learning Path)</w:t>
+        <w:t xml:space="preserve">Peserta Studi Independen - </w:t>
+      </w:r>
+      <w:bookmarkStart w:id="1" w:name="_Hlk215008687"/>
+      <w:r>
+        <w:rPr>
+          <w:rFonts w:asciiTheme="minorHAnsi" w:eastAsia="Georgia" w:hAnsiTheme="minorHAnsi" w:cstheme="minorHAnsi"/>
+          <w:b/>
+          <w:sz w:val="24"/>
+          <w:szCs w:val="24"/>
+        </w:rPr>
+        <w:t>Bangkit Academy 2024</w:t>
+      </w:r>
+      <w:bookmarkEnd w:id="1"/>
+      <w:r>
+        <w:rPr>
+          <w:rFonts w:asciiTheme="minorHAnsi" w:eastAsia="Georgia" w:hAnsiTheme="minorHAnsi" w:cstheme="minorHAnsi"/>
+          <w:b/>
+          <w:sz w:val="24"/>
+          <w:szCs w:val="24"/>
+        </w:rPr>
+        <w:t xml:space="preserve"> (Mobile Development Learning Path)</w:t>
       </w:r>
     </w:p>
     <w:p>
@@ -462,7 +482,7 @@
           <w:szCs w:val="24"/>
         </w:rPr>
       </w:pPr>
-      <w:bookmarkStart w:id="1" w:name="_Hlk201308620"/>
+      <w:bookmarkStart w:id="2" w:name="_Hlk201308620"/>
       <w:r>
         <w:rPr>
           <w:rFonts w:asciiTheme="minorHAnsi" w:eastAsia="Georgia" w:hAnsiTheme="minorHAnsi" w:cstheme="minorHAnsi"/>
@@ -490,7 +510,7 @@
         </w:rPr>
         <w:t xml:space="preserve"> - Januari 202</w:t>
       </w:r>
-      <w:bookmarkEnd w:id="1"/>
+      <w:bookmarkEnd w:id="2"/>
       <w:r>
         <w:rPr>
           <w:rFonts w:asciiTheme="minorHAnsi" w:eastAsia="Georgia" w:hAnsiTheme="minorHAnsi" w:cstheme="minorHAnsi"/>
@@ -645,7 +665,7 @@
           <w:sz w:val="24"/>
           <w:szCs w:val="24"/>
         </w:rPr>
-        <w:t>Aplikasi "JasKang" - Proyek Penulisan Ilmiah</w:t>
+        <w:t>Aplikasi "JasKang" - Penulisan Ilmiah</w:t>
       </w:r>
     </w:p>
     <w:p>
@@ -714,7 +734,117 @@
           <w:sz w:val="24"/>
           <w:szCs w:val="24"/>
         </w:rPr>
-        <w:t>Aplikasi "KePri" - Proyek Tugas Akhir</w:t>
+        <w:t>Aplikasi "</w:t>
+      </w:r>
+      <w:r>
+        <w:rPr>
+          <w:rFonts w:asciiTheme="minorHAnsi" w:eastAsia="Georgia" w:hAnsiTheme="minorHAnsi" w:cstheme="minorHAnsi"/>
+          <w:b/>
+          <w:bCs/>
+          <w:sz w:val="24"/>
+          <w:szCs w:val="24"/>
+        </w:rPr>
+        <w:t>SEJAHTERA</w:t>
+      </w:r>
+      <w:r>
+        <w:rPr>
+          <w:rFonts w:asciiTheme="minorHAnsi" w:eastAsia="Georgia" w:hAnsiTheme="minorHAnsi" w:cstheme="minorHAnsi"/>
+          <w:b/>
+          <w:bCs/>
+          <w:sz w:val="24"/>
+          <w:szCs w:val="24"/>
+        </w:rPr>
+        <w:t xml:space="preserve">" - Bangkit Academy </w:t>
+      </w:r>
+      <w:r>
+        <w:rPr>
+          <w:rFonts w:asciiTheme="minorHAnsi" w:eastAsia="Georgia" w:hAnsiTheme="minorHAnsi" w:cstheme="minorHAnsi"/>
+          <w:b/>
+          <w:bCs/>
+          <w:sz w:val="24"/>
+          <w:szCs w:val="24"/>
+        </w:rPr>
+        <w:t xml:space="preserve">2024 </w:t>
+      </w:r>
+      <w:r>
+        <w:rPr>
+          <w:rFonts w:asciiTheme="minorHAnsi" w:eastAsia="Georgia" w:hAnsiTheme="minorHAnsi" w:cstheme="minorHAnsi"/>
+          <w:b/>
+          <w:bCs/>
+          <w:sz w:val="24"/>
+          <w:szCs w:val="24"/>
+        </w:rPr>
+        <w:t>By</w:t>
+      </w:r>
+      <w:r>
+        <w:rPr>
+          <w:rFonts w:asciiTheme="minorHAnsi" w:eastAsia="Georgia" w:hAnsiTheme="minorHAnsi" w:cstheme="minorHAnsi"/>
+          <w:b/>
+          <w:bCs/>
+          <w:sz w:val="24"/>
+          <w:szCs w:val="24"/>
+        </w:rPr>
+        <w:t xml:space="preserve"> </w:t>
+      </w:r>
+      <w:r>
+        <w:rPr>
+          <w:rFonts w:asciiTheme="minorHAnsi" w:eastAsia="Georgia" w:hAnsiTheme="minorHAnsi" w:cstheme="minorHAnsi"/>
+          <w:b/>
+          <w:bCs/>
+          <w:sz w:val="24"/>
+          <w:szCs w:val="24"/>
+        </w:rPr>
+        <w:t>Google</w:t>
+      </w:r>
+      <w:r>
+        <w:rPr>
+          <w:rFonts w:asciiTheme="minorHAnsi" w:eastAsia="Georgia" w:hAnsiTheme="minorHAnsi" w:cstheme="minorHAnsi"/>
+          <w:b/>
+          <w:bCs/>
+          <w:sz w:val="24"/>
+          <w:szCs w:val="24"/>
+        </w:rPr>
+        <w:t xml:space="preserve">, Goto </w:t>
+      </w:r>
+      <w:r>
+        <w:rPr>
+          <w:rFonts w:asciiTheme="minorHAnsi" w:eastAsia="Georgia" w:hAnsiTheme="minorHAnsi" w:cstheme="minorHAnsi"/>
+          <w:b/>
+          <w:bCs/>
+          <w:sz w:val="24"/>
+          <w:szCs w:val="24"/>
+        </w:rPr>
+        <w:t xml:space="preserve">&amp; </w:t>
+      </w:r>
+      <w:r>
+        <w:rPr>
+          <w:rFonts w:asciiTheme="minorHAnsi" w:eastAsia="Georgia" w:hAnsiTheme="minorHAnsi" w:cstheme="minorHAnsi"/>
+          <w:b/>
+          <w:bCs/>
+          <w:sz w:val="24"/>
+          <w:szCs w:val="24"/>
+        </w:rPr>
+        <w:t>T</w:t>
+      </w:r>
+      <w:r>
+        <w:rPr>
+          <w:rFonts w:asciiTheme="minorHAnsi" w:eastAsia="Georgia" w:hAnsiTheme="minorHAnsi" w:cstheme="minorHAnsi"/>
+          <w:b/>
+          <w:bCs/>
+          <w:sz w:val="24"/>
+          <w:szCs w:val="24"/>
+        </w:rPr>
+        <w:t>raveloka</w:t>
+      </w:r>
+      <w:r>
+        <w:rPr>
+          <w:rFonts w:asciiTheme="minorHAnsi" w:eastAsia="Georgia" w:hAnsiTheme="minorHAnsi" w:cstheme="minorHAnsi"/>
+          <w:b/>
+          <w:bCs/>
+          <w:sz w:val="24"/>
+          <w:szCs w:val="24"/>
+        </w:rPr>
+        <w:t xml:space="preserve"> (Capstone Project)</w:t>
       </w:r>
     </w:p>
     <w:p>
@@ -735,7 +865,47 @@
           <w:sz w:val="24"/>
           <w:szCs w:val="24"/>
         </w:rPr>
-        <w:t xml:space="preserve">Juni 2025 – Agustus </w:t>
+        <w:t>September</w:t>
+      </w:r>
+      <w:r>
+        <w:rPr>
+          <w:rFonts w:asciiTheme="minorHAnsi" w:eastAsia="Georgia" w:hAnsiTheme="minorHAnsi" w:cstheme="minorHAnsi"/>
+          <w:sz w:val="24"/>
+          <w:szCs w:val="24"/>
+        </w:rPr>
+        <w:t xml:space="preserve"> 202</w:t>
+      </w:r>
+      <w:r>
+        <w:rPr>
+          <w:rFonts w:asciiTheme="minorHAnsi" w:eastAsia="Georgia" w:hAnsiTheme="minorHAnsi" w:cstheme="minorHAnsi"/>
+          <w:sz w:val="24"/>
+          <w:szCs w:val="24"/>
+        </w:rPr>
+        <w:t>4</w:t>
+      </w:r>
+      <w:r>
+        <w:rPr>
+          <w:rFonts w:asciiTheme="minorHAnsi" w:eastAsia="Georgia" w:hAnsiTheme="minorHAnsi" w:cstheme="minorHAnsi"/>
+          <w:sz w:val="24"/>
+          <w:szCs w:val="24"/>
+        </w:rPr>
+        <w:t xml:space="preserve"> – </w:t>
+      </w:r>
+      <w:r>
+        <w:rPr>
+          <w:rFonts w:asciiTheme="minorHAnsi" w:eastAsia="Georgia" w:hAnsiTheme="minorHAnsi" w:cstheme="minorHAnsi"/>
+          <w:sz w:val="24"/>
+          <w:szCs w:val="24"/>
+        </w:rPr>
+        <w:t>Januari</w:t>
+      </w:r>
+      <w:r>
+        <w:rPr>
+          <w:rFonts w:asciiTheme="minorHAnsi" w:eastAsia="Georgia" w:hAnsiTheme="minorHAnsi" w:cstheme="minorHAnsi"/>
+          <w:sz w:val="24"/>
+          <w:szCs w:val="24"/>
+        </w:rPr>
+        <w:t xml:space="preserve"> </w:t>
       </w:r>
       <w:r>
         <w:rPr>
@@ -780,7 +950,31 @@
           <w:sz w:val="24"/>
           <w:szCs w:val="24"/>
         </w:rPr>
-        <w:t xml:space="preserve"> dan visualisasi data keuangan menggunakan Kotlin dan Android Studio</w:t>
+        <w:t xml:space="preserve"> dan </w:t>
+      </w:r>
+      <w:r>
+        <w:rPr>
+          <w:rFonts w:asciiTheme="minorHAnsi" w:eastAsia="Georgia" w:hAnsiTheme="minorHAnsi" w:cstheme="minorHAnsi"/>
+          <w:sz w:val="24"/>
+          <w:szCs w:val="24"/>
+        </w:rPr>
+        <w:t xml:space="preserve">rekomendasi keuangan </w:t>
+      </w:r>
+      <w:r>
+        <w:rPr>
+          <w:rFonts w:asciiTheme="minorHAnsi" w:eastAsia="Georgia" w:hAnsiTheme="minorHAnsi" w:cstheme="minorHAnsi"/>
+          <w:sz w:val="24"/>
+          <w:szCs w:val="24"/>
+        </w:rPr>
+        <w:t xml:space="preserve">bulanan </w:t>
+      </w:r>
+      <w:r>
+        <w:rPr>
+          <w:rFonts w:asciiTheme="minorHAnsi" w:eastAsia="Georgia" w:hAnsiTheme="minorHAnsi" w:cstheme="minorHAnsi"/>
+          <w:sz w:val="24"/>
+          <w:szCs w:val="24"/>
+        </w:rPr>
+        <w:t>menggunakan Kotlin dan Android Studio</w:t>
       </w:r>
     </w:p>
     <w:p>

</xml_diff>